<commit_message>
Star creating the BPMN for our project
</commit_message>
<xml_diff>
--- a/Documents/Activities/Formato Solución Problemas Lógica (2).docx
+++ b/Documents/Activities/Formato Solución Problemas Lógica (2).docx
@@ -5458,6 +5458,12 @@
           <w:rFonts w:asciiTheme="majorHAnsi" w:hAnsiTheme="majorHAnsi" w:cstheme="majorHAnsi"/>
         </w:rPr>
       </w:pPr>
+      <w:r>
+        <w:rPr>
+          <w:rFonts w:asciiTheme="majorHAnsi" w:hAnsiTheme="majorHAnsi" w:cstheme="majorHAnsi"/>
+        </w:rPr>
+        <w:t>z</w:t>
+      </w:r>
     </w:p>
     <w:p>
       <w:pPr>

</xml_diff>